<commit_message>
Move repo link to title page and cover letter, out of blind manuscript
The title page already carries the author's name/email, so the real
repo URL there leaks nothing new, and reviewers see the title page
under FRL's stated single-anonymized policy. The cover letter reaches
the editor regardless of review model. The blinded manuscript's Data
availability statement now points to "see title page" instead of an
unhelpful "available upon request," giving reviewers/editor a working
link somewhere while keeping the manuscript file itself anonymous.
</commit_message>
<xml_diff>
--- a/paper/title_page.docx
+++ b/paper/title_page.docx
@@ -43,6 +43,14 @@
       </w:pPr>
       <w:r>
         <w:t xml:space="preserve">Corresponding author. Email: rrn2111@caa.columbia.edu</w:t>
+      </w:r>
+    </w:p>
+    <w:p>
+      <w:pPr>
+        <w:pStyle w:val="BodyText"/>
+      </w:pPr>
+      <w:r>
+        <w:t xml:space="preserve">Code and result logs: https://github.com/raghuram87/execution-aware-alpha-mining (withheld from the anonymized manuscript file to preserve author anonymity during peer review; see that file’s Data availability statement)</w:t>
       </w:r>
     </w:p>
     <w:sectPr/>

</xml_diff>